<commit_message>
docs: finalize Sprint 1 deliverables
</commit_message>
<xml_diff>
--- a/docs/SAD/Burndown_Chart_SAD.docx
+++ b/docs/SAD/Burndown_Chart_SAD.docx
@@ -9162,7 +9162,7 @@
           <w:sz w:val="21"/>
           <w:szCs w:val="21"/>
         </w:rPr>
-        <w:t xml:space="preserve">The design uses one flow for every user action, which keeps results consistent and updates fast (BDC-NF-001): validate the input, store it through DataManager, recalculate with BurndownEngine, then re-render the chart, KPI cards and backlog table. DataManager is the single source of truth; BurndownEngine functions are pure; ChartManager only draws; UIManager only handles the DOM.</w:t>
+        <w:t xml:space="preserve">The design uses one flow for every user action, which keeps results consistent and updates fast (BDC-NF-001): validate the input, store it through DataManager, recalculate with BurndownEngine, then re-render the chart, KPI cards and backlog table. DataManager is the single source of truth; BurndownEngine functions are pure; ChartManager only draws; the UI layer (chart.js, dashboard.js, and related components) only handles the DOM.</w:t>
       </w:r>
     </w:p>
     <w:p>
@@ -12270,7 +12270,7 @@
           <w:sz w:val="21"/>
           <w:szCs w:val="21"/>
         </w:rPr>
-        <w:t xml:space="preserve">quality is monitored through the Jest results in GitHub Actions, defects logged as GitHub Issues, and DevTools timing checks against the 2-second target (BDC-NF-001).</w:t>
+        <w:t xml:space="preserve">quality is monitored through the Node.js native test runner (node --test) results in GitHub Actions, defects logged as GitHub Issues, and DevTools timing checks against the 2-second target (BDC-NF-001).</w:t>
       </w:r>
     </w:p>
     <w:p>
@@ -13530,7 +13530,7 @@
           <w:sz w:val="21"/>
           <w:szCs w:val="21"/>
         </w:rPr>
-        <w:t xml:space="preserve">Development and testing: Chart.js, Jest, browser DevTools</w:t>
+        <w:t xml:space="preserve">Development and testing: Chart.js, Node.js native test runner (node --test), browser DevTools</w:t>
       </w:r>
     </w:p>
     <w:p>

</xml_diff>

<commit_message>
docs: finalize Sprint 1 deliverables, test plan, and demo video
</commit_message>
<xml_diff>
--- a/docs/SAD/Burndown_Chart_SAD.docx
+++ b/docs/SAD/Burndown_Chart_SAD.docx
@@ -9162,7 +9162,7 @@
           <w:sz w:val="21"/>
           <w:szCs w:val="21"/>
         </w:rPr>
-        <w:t xml:space="preserve">The design uses one flow for every user action, which keeps results consistent and updates fast (BDC-NF-001): validate the input, store it through DataManager, recalculate with BurndownEngine, then re-render the chart, KPI cards and backlog table. DataManager is the single source of truth; BurndownEngine functions are pure; ChartManager only draws; UIManager only handles the DOM.</w:t>
+        <w:t xml:space="preserve">The design uses one flow for every user action, which keeps results consistent and updates fast (BDC-NF-001): validate the input, store it through DataManager, recalculate with BurndownEngine, then re-render the chart, KPI cards and backlog table. DataManager is the single source of truth; BurndownEngine functions are pure; ChartManager only draws; the UI layer (chart.js, dashboard.js, and related components) only handles the DOM.</w:t>
       </w:r>
     </w:p>
     <w:p>
@@ -12270,7 +12270,7 @@
           <w:sz w:val="21"/>
           <w:szCs w:val="21"/>
         </w:rPr>
-        <w:t xml:space="preserve">quality is monitored through the Jest results in GitHub Actions, defects logged as GitHub Issues, and DevTools timing checks against the 2-second target (BDC-NF-001).</w:t>
+        <w:t xml:space="preserve">quality is monitored through the Node.js native test runner (node --test) results in GitHub Actions, defects logged as GitHub Issues, and DevTools timing checks against the 2-second target (BDC-NF-001).</w:t>
       </w:r>
     </w:p>
     <w:p>
@@ -13530,7 +13530,7 @@
           <w:sz w:val="21"/>
           <w:szCs w:val="21"/>
         </w:rPr>
-        <w:t xml:space="preserve">Development and testing: Chart.js, Jest, browser DevTools</w:t>
+        <w:t xml:space="preserve">Development and testing: Chart.js, Node.js native test runner (node --test), browser DevTools</w:t>
       </w:r>
     </w:p>
     <w:p>

</xml_diff>

<commit_message>
docs: finalize Sprint 1 deliverables, test plan, and demo video (#37)
## Summary
Finalize the Sprint 1 documentation, test plan alignment, and
demonstration deliverables on `main`.

## Inclusions
- Updated `README.md` and `CONTRIBUTING.md`
- Added `demo_sprint1_mvp.mp4` (Sprint 1 MVP 1-minute walkthrough)
- Updated `docs/SAD/Burndown_Chart_SAD.docx` and
`docs/test-plan/Burndown_Chart_Test_Plan.docx`
- Updated `docs/test-plan/sprint1_checklist.md` with verified evidence
and sign-offs
- Excluded original document backups in `.gitignore`
</commit_message>
<xml_diff>
--- a/docs/SAD/Burndown_Chart_SAD.docx
+++ b/docs/SAD/Burndown_Chart_SAD.docx
@@ -9162,7 +9162,7 @@
           <w:sz w:val="21"/>
           <w:szCs w:val="21"/>
         </w:rPr>
-        <w:t xml:space="preserve">The design uses one flow for every user action, which keeps results consistent and updates fast (BDC-NF-001): validate the input, store it through DataManager, recalculate with BurndownEngine, then re-render the chart, KPI cards and backlog table. DataManager is the single source of truth; BurndownEngine functions are pure; ChartManager only draws; UIManager only handles the DOM.</w:t>
+        <w:t xml:space="preserve">The design uses one flow for every user action, which keeps results consistent and updates fast (BDC-NF-001): validate the input, store it through DataManager, recalculate with BurndownEngine, then re-render the chart, KPI cards and backlog table. DataManager is the single source of truth; BurndownEngine functions are pure; ChartManager only draws; the UI layer (chart.js, dashboard.js, and related components) only handles the DOM.</w:t>
       </w:r>
     </w:p>
     <w:p>
@@ -12270,7 +12270,7 @@
           <w:sz w:val="21"/>
           <w:szCs w:val="21"/>
         </w:rPr>
-        <w:t xml:space="preserve">quality is monitored through the Jest results in GitHub Actions, defects logged as GitHub Issues, and DevTools timing checks against the 2-second target (BDC-NF-001).</w:t>
+        <w:t xml:space="preserve">quality is monitored through the Node.js native test runner (node --test) results in GitHub Actions, defects logged as GitHub Issues, and DevTools timing checks against the 2-second target (BDC-NF-001).</w:t>
       </w:r>
     </w:p>
     <w:p>
@@ -13530,7 +13530,7 @@
           <w:sz w:val="21"/>
           <w:szCs w:val="21"/>
         </w:rPr>
-        <w:t xml:space="preserve">Development and testing: Chart.js, Jest, browser DevTools</w:t>
+        <w:t xml:space="preserve">Development and testing: Chart.js, Node.js native test runner (node --test), browser DevTools</w:t>
       </w:r>
     </w:p>
     <w:p>

</xml_diff>